<commit_message>
mass push fe acceptance materials
</commit_message>
<xml_diff>
--- a/drafts/TT23_supp_v1.0.docx
+++ b/drafts/TT23_supp_v1.0.docx
@@ -4,7 +4,7 @@
   <w:body>
     <w:p>
       <w:pPr>
-        <w:spacing w:line="480" w:lineRule="auto"/>
+        <w:spacing w:line="360" w:lineRule="auto"/>
         <w:rPr>
           <w:b/>
         </w:rPr>
@@ -24,86 +24,256 @@
       <w:r>
         <w:rPr>
           <w:b/>
-        </w:rPr>
-        <w:t>Negative effects of allelopathic plant invasion accumulate as the growth season progresses”</w:t>
+          <w:bCs/>
+        </w:rPr>
+        <w:t xml:space="preserve">The negative effects of an allelopathic invader on native plant photosynthesis </w:t>
+      </w:r>
+      <w:r>
+        <w:rPr>
+          <w:b/>
+          <w:bCs/>
+        </w:rPr>
+        <w:t>are amplified after tree canopy closure</w:t>
+      </w:r>
+      <w:r>
+        <w:rPr>
+          <w:b/>
+        </w:rPr>
+        <w:t>”</w:t>
+      </w:r>
+    </w:p>
+    <w:p>
+      <w:pPr>
+        <w:spacing w:line="360" w:lineRule="auto"/>
+      </w:pPr>
+      <w:r>
+        <w:t>Evan A. Perkowski</w:t>
+      </w:r>
+      <w:proofErr w:type="gramStart"/>
+      <w:r>
+        <w:rPr>
+          <w:vertAlign w:val="superscript"/>
+        </w:rPr>
+        <w:t>1,*</w:t>
+      </w:r>
+      <w:proofErr w:type="gramEnd"/>
+      <w:r>
+        <w:t>, K. Carroll</w:t>
+      </w:r>
+      <w:r>
+        <w:rPr>
+          <w:vertAlign w:val="superscript"/>
+        </w:rPr>
+        <w:t>1</w:t>
+      </w:r>
+      <w:r>
+        <w:t>, Jessie Mutz</w:t>
+      </w:r>
+      <w:r>
+        <w:rPr>
+          <w:vertAlign w:val="superscript"/>
+        </w:rPr>
+        <w:t>2,3</w:t>
+      </w:r>
+      <w:r>
+        <w:t xml:space="preserve">, </w:t>
+      </w:r>
+      <w:proofErr w:type="spellStart"/>
+      <w:r>
+        <w:t>Snehanjana</w:t>
+      </w:r>
+      <w:proofErr w:type="spellEnd"/>
+      <w:r>
+        <w:t xml:space="preserve"> Chatterjee</w:t>
+      </w:r>
+      <w:r>
+        <w:rPr>
+          <w:vertAlign w:val="superscript"/>
+        </w:rPr>
+        <w:t>1</w:t>
+      </w:r>
+      <w:r>
+        <w:t xml:space="preserve">, </w:t>
+      </w:r>
+      <w:proofErr w:type="spellStart"/>
+      <w:r>
+        <w:t>Xianyu</w:t>
+      </w:r>
+      <w:proofErr w:type="spellEnd"/>
+      <w:r>
+        <w:t xml:space="preserve"> Yang</w:t>
+      </w:r>
+      <w:r>
+        <w:rPr>
+          <w:vertAlign w:val="superscript"/>
+        </w:rPr>
+        <w:t>4,5</w:t>
+      </w:r>
+      <w:r>
+        <w:t>, Lalasia Bialic-Murphy</w:t>
+      </w:r>
+      <w:r>
+        <w:rPr>
+          <w:vertAlign w:val="superscript"/>
+        </w:rPr>
+        <w:t>4,5</w:t>
+      </w:r>
+      <w:r>
+        <w:t>, Stephanie N. Kivlin</w:t>
+      </w:r>
+      <w:r>
+        <w:rPr>
+          <w:vertAlign w:val="superscript"/>
+        </w:rPr>
+        <w:t>3</w:t>
+      </w:r>
+      <w:r>
+        <w:t>, Susan Kalisz</w:t>
+      </w:r>
+      <w:r>
+        <w:rPr>
+          <w:vertAlign w:val="superscript"/>
+        </w:rPr>
+        <w:t>3</w:t>
+      </w:r>
+      <w:r>
+        <w:t>,</w:t>
+      </w:r>
+      <w:r>
+        <w:rPr>
+          <w:vertAlign w:val="superscript"/>
+        </w:rPr>
+        <w:t xml:space="preserve"> </w:t>
+      </w:r>
+      <w:r>
+        <w:t>Nicholas G. Smith</w:t>
+      </w:r>
+      <w:r>
+        <w:rPr>
+          <w:vertAlign w:val="superscript"/>
+        </w:rPr>
+        <w:t>1</w:t>
+      </w:r>
+    </w:p>
+    <w:p>
+      <w:pPr>
+        <w:spacing w:line="360" w:lineRule="auto"/>
+        <w:rPr>
+          <w:b/>
+        </w:rPr>
+      </w:pPr>
+    </w:p>
+    <w:p>
+      <w:pPr>
+        <w:spacing w:line="360" w:lineRule="auto"/>
+      </w:pPr>
+      <w:r>
+        <w:rPr>
+          <w:vertAlign w:val="superscript"/>
+        </w:rPr>
+        <w:t>1</w:t>
+      </w:r>
+      <w:r>
+        <w:t>Department of Biological Sciences, Texas Tech University, Lubbock, TX, USA</w:t>
+      </w:r>
+    </w:p>
+    <w:p>
+      <w:pPr>
+        <w:tabs>
+          <w:tab w:val="left" w:pos="180"/>
+        </w:tabs>
+        <w:spacing w:line="360" w:lineRule="auto"/>
+      </w:pPr>
+      <w:r>
+        <w:rPr>
+          <w:vertAlign w:val="superscript"/>
+        </w:rPr>
+        <w:t>2</w:t>
+      </w:r>
+      <w:r>
+        <w:t>Department of Biological Sciences, Dartmouth College, Hanover, NH, USA</w:t>
+      </w:r>
+    </w:p>
+    <w:p>
+      <w:pPr>
+        <w:spacing w:line="360" w:lineRule="auto"/>
+      </w:pPr>
+      <w:r>
+        <w:rPr>
+          <w:vertAlign w:val="superscript"/>
+        </w:rPr>
+        <w:t>3</w:t>
+      </w:r>
+      <w:r>
+        <w:t>Department of Ecology and Evolutionary Biology, University of Tennessee-Knoxville, Knoxville, TN, USA</w:t>
+      </w:r>
+    </w:p>
+    <w:p>
+      <w:pPr>
+        <w:spacing w:line="360" w:lineRule="auto"/>
+      </w:pPr>
+      <w:r>
+        <w:rPr>
+          <w:vertAlign w:val="superscript"/>
+        </w:rPr>
+        <w:t>4</w:t>
+      </w:r>
+      <w:r>
+        <w:t>Institute of Integrative Biology, ETH Zürich, Zürich, Switzerland</w:t>
+      </w:r>
+    </w:p>
+    <w:p>
+      <w:pPr>
+        <w:spacing w:line="360" w:lineRule="auto"/>
+      </w:pPr>
+      <w:r>
+        <w:rPr>
+          <w:vertAlign w:val="superscript"/>
+        </w:rPr>
+        <w:t>5</w:t>
+      </w:r>
+      <w:r>
+        <w:t xml:space="preserve">Land Change Science Research Unit, Swiss Federal Research Institute WSL, </w:t>
+      </w:r>
+      <w:proofErr w:type="spellStart"/>
+      <w:r>
+        <w:t>Birmensdorf</w:t>
+      </w:r>
+      <w:proofErr w:type="spellEnd"/>
+      <w:r>
+        <w:t>, Switzerland</w:t>
+      </w:r>
+    </w:p>
+    <w:p>
+      <w:pPr>
+        <w:spacing w:line="360" w:lineRule="auto"/>
+      </w:pPr>
+    </w:p>
+    <w:p>
+      <w:pPr>
+        <w:rPr>
+          <w:b/>
+        </w:rPr>
+      </w:pPr>
+      <w:r>
+        <w:rPr>
+          <w:b/>
+        </w:rPr>
+        <w:br w:type="page"/>
       </w:r>
     </w:p>
     <w:p>
       <w:pPr>
         <w:spacing w:line="480" w:lineRule="auto"/>
+        <w:rPr>
+          <w:b/>
+        </w:rPr>
       </w:pPr>
       <w:r>
-        <w:t xml:space="preserve">Evan A. Perkowski, K. Carroll, Jessie Mutz, </w:t>
-      </w:r>
-      <w:proofErr w:type="spellStart"/>
-      <w:r>
-        <w:t>Snehanjana</w:t>
-      </w:r>
-      <w:proofErr w:type="spellEnd"/>
-      <w:r>
-        <w:t xml:space="preserve"> Chatterjee, </w:t>
-      </w:r>
-      <w:proofErr w:type="spellStart"/>
-      <w:r>
-        <w:t>Xianyu</w:t>
-      </w:r>
-      <w:proofErr w:type="spellEnd"/>
-      <w:r>
-        <w:t xml:space="preserve"> Yang, </w:t>
-      </w:r>
-      <w:proofErr w:type="spellStart"/>
-      <w:r>
-        <w:t>Lalasia</w:t>
-      </w:r>
-      <w:proofErr w:type="spellEnd"/>
-      <w:r>
-        <w:t xml:space="preserve"> </w:t>
-      </w:r>
-      <w:proofErr w:type="spellStart"/>
-      <w:r>
-        <w:t>Bialic</w:t>
-      </w:r>
-      <w:proofErr w:type="spellEnd"/>
-      <w:r>
-        <w:t>-Murphy, Stephanie N. Kivlin, Susan Kalisz,</w:t>
-      </w:r>
-      <w:r>
-        <w:rPr>
-          <w:vertAlign w:val="superscript"/>
-        </w:rPr>
-        <w:t xml:space="preserve"> </w:t>
-      </w:r>
-      <w:r>
-        <w:t>Nicholas G. Smith</w:t>
-      </w:r>
-    </w:p>
-    <w:p>
-      <w:pPr>
-        <w:spacing w:line="480" w:lineRule="auto"/>
-        <w:rPr>
-          <w:b/>
-        </w:rPr>
-      </w:pPr>
-    </w:p>
-    <w:p>
-      <w:pPr>
-        <w:spacing w:line="480" w:lineRule="auto"/>
-        <w:rPr>
-          <w:b/>
-        </w:rPr>
-      </w:pPr>
-    </w:p>
-    <w:p>
-      <w:pPr>
-        <w:spacing w:line="480" w:lineRule="auto"/>
-        <w:rPr>
-          <w:b/>
-        </w:rPr>
-      </w:pPr>
-      <w:r>
-        <w:rPr>
-          <w:b/>
-        </w:rPr>
+        <w:rPr>
+          <w:b/>
+        </w:rPr>
+        <w:lastRenderedPageBreak/>
         <w:t>Figure S1</w:t>
       </w:r>
     </w:p>
@@ -180,69 +350,43 @@
         <w:rPr>
           <w:i/>
         </w:rPr>
-        <w:t xml:space="preserve">A. </w:t>
-      </w:r>
-      <w:proofErr w:type="spellStart"/>
+        <w:t>A. petiolata</w:t>
+      </w:r>
+      <w:r>
+        <w:t xml:space="preserve"> treatment and tree canopy status </w:t>
+      </w:r>
+      <w:r>
+        <w:rPr>
+          <w:color w:val="0E101A"/>
+        </w:rPr>
+        <w:t xml:space="preserve">on soil nitrate availability (a) and soil ammonium availability (b). </w:t>
+      </w:r>
+      <w:r>
+        <w:rPr>
+          <w:color w:val="0E101A"/>
+        </w:rPr>
+        <w:t xml:space="preserve">Tree canopy status is on the x-axis. Teal points and boxplots indicate measurements collected in plots where </w:t>
+      </w:r>
       <w:r>
         <w:rPr>
           <w:i/>
-        </w:rPr>
-        <w:t>petiolata</w:t>
-      </w:r>
-      <w:proofErr w:type="spellEnd"/>
-      <w:r>
-        <w:t xml:space="preserve"> treatment and tree canopy status </w:t>
-      </w:r>
-      <w:r>
-        <w:rPr>
-          <w:color w:val="0E101A"/>
-        </w:rPr>
-        <w:t xml:space="preserve">on soil nitrate availability (a) and soil ammonium availability (b). </w:t>
-      </w:r>
-      <w:r>
-        <w:rPr>
-          <w:color w:val="0E101A"/>
-        </w:rPr>
-        <w:t xml:space="preserve">Tree canopy status is on the x-axis. Teal points and boxplots indicate measurements collected in plots where </w:t>
+          <w:color w:val="0E101A"/>
+        </w:rPr>
+        <w:t>A. petiolata</w:t>
+      </w:r>
+      <w:r>
+        <w:rPr>
+          <w:color w:val="0E101A"/>
+        </w:rPr>
+        <w:t xml:space="preserve"> was weeded and gold points and boxplots indicate measurements collected in subplots where </w:t>
       </w:r>
       <w:r>
         <w:rPr>
           <w:i/>
           <w:color w:val="0E101A"/>
         </w:rPr>
-        <w:t xml:space="preserve">A. </w:t>
-      </w:r>
-      <w:proofErr w:type="spellStart"/>
-      <w:r>
-        <w:rPr>
-          <w:i/>
-          <w:color w:val="0E101A"/>
-        </w:rPr>
-        <w:t>petiolata</w:t>
-      </w:r>
-      <w:proofErr w:type="spellEnd"/>
-      <w:r>
-        <w:rPr>
-          <w:color w:val="0E101A"/>
-        </w:rPr>
-        <w:t xml:space="preserve"> was weeded and gold points and boxplots indicate measurements collected in subplots where </w:t>
-      </w:r>
-      <w:r>
-        <w:rPr>
-          <w:i/>
-          <w:color w:val="0E101A"/>
-        </w:rPr>
-        <w:t xml:space="preserve">A. </w:t>
-      </w:r>
-      <w:proofErr w:type="spellStart"/>
-      <w:r>
-        <w:rPr>
-          <w:i/>
-          <w:color w:val="0E101A"/>
-        </w:rPr>
-        <w:t>petiolata</w:t>
-      </w:r>
-      <w:proofErr w:type="spellEnd"/>
+        <w:t>A. petiolata</w:t>
+      </w:r>
       <w:r>
         <w:rPr>
           <w:color w:val="0E101A"/>
@@ -283,49 +427,18 @@
           <w:b/>
         </w:rPr>
       </w:pPr>
-    </w:p>
-    <w:p>
-      <w:pPr>
-        <w:spacing w:line="480" w:lineRule="auto"/>
-        <w:rPr>
-          <w:b/>
-        </w:rPr>
-      </w:pPr>
-    </w:p>
-    <w:p>
-      <w:pPr>
-        <w:spacing w:line="480" w:lineRule="auto"/>
-        <w:rPr>
-          <w:b/>
-        </w:rPr>
-      </w:pPr>
-    </w:p>
-    <w:p>
-      <w:pPr>
-        <w:spacing w:line="480" w:lineRule="auto"/>
-        <w:rPr>
-          <w:b/>
-        </w:rPr>
-      </w:pPr>
-    </w:p>
-    <w:p>
-      <w:pPr>
-        <w:spacing w:line="480" w:lineRule="auto"/>
-        <w:rPr>
-          <w:b/>
-        </w:rPr>
-      </w:pPr>
-      <w:r>
-        <w:rPr>
-          <w:b/>
-        </w:rPr>
+      <w:r>
+        <w:rPr>
+          <w:b/>
+        </w:rPr>
+        <w:lastRenderedPageBreak/>
         <w:t>Figure S</w:t>
       </w:r>
       <w:r>
         <w:rPr>
           <w:b/>
         </w:rPr>
-        <w:t>4</w:t>
+        <w:t>2</w:t>
       </w:r>
     </w:p>
     <w:p>
@@ -416,16 +529,8 @@
         <w:rPr>
           <w:i/>
         </w:rPr>
-        <w:t xml:space="preserve">A. </w:t>
-      </w:r>
-      <w:proofErr w:type="spellStart"/>
-      <w:r>
-        <w:rPr>
-          <w:i/>
-        </w:rPr>
-        <w:t>petiolata</w:t>
-      </w:r>
-      <w:proofErr w:type="spellEnd"/>
+        <w:t>A. petiolata</w:t>
+      </w:r>
       <w:r>
         <w:t xml:space="preserve"> treatment and tree canopy status on</w:t>
       </w:r>
@@ -484,39 +589,21 @@
           <w:i/>
           <w:color w:val="0E101A"/>
         </w:rPr>
-        <w:t xml:space="preserve">A. </w:t>
-      </w:r>
-      <w:proofErr w:type="spellStart"/>
+        <w:t>A. petiolata</w:t>
+      </w:r>
+      <w:r>
+        <w:rPr>
+          <w:color w:val="0E101A"/>
+        </w:rPr>
+        <w:t xml:space="preserve"> was weeded and gold points and boxplots indicate measurements collected in subplots where </w:t>
+      </w:r>
       <w:r>
         <w:rPr>
           <w:i/>
           <w:color w:val="0E101A"/>
         </w:rPr>
-        <w:t>petiolata</w:t>
-      </w:r>
-      <w:proofErr w:type="spellEnd"/>
-      <w:r>
-        <w:rPr>
-          <w:color w:val="0E101A"/>
-        </w:rPr>
-        <w:t xml:space="preserve"> was weeded and gold points and boxplots indicate measurements collected in subplots where </w:t>
-      </w:r>
-      <w:r>
-        <w:rPr>
-          <w:i/>
-          <w:color w:val="0E101A"/>
-        </w:rPr>
-        <w:t xml:space="preserve">A. </w:t>
-      </w:r>
-      <w:proofErr w:type="spellStart"/>
-      <w:r>
-        <w:rPr>
-          <w:i/>
-          <w:color w:val="0E101A"/>
-        </w:rPr>
-        <w:t>petiolata</w:t>
-      </w:r>
-      <w:proofErr w:type="spellEnd"/>
+        <w:t>A. petiolata</w:t>
+      </w:r>
       <w:r>
         <w:rPr>
           <w:color w:val="0E101A"/>

</xml_diff>